<commit_message>
Adicionado especies na biodiversidade
</commit_message>
<xml_diff>
--- a/Requisitos_MVP_Circuito_Tere_Verde.docx
+++ b/Requisitos_MVP_Circuito_Tere_Verde.docx
@@ -689,8 +689,42 @@
         <w:pStyle w:val="Commarcadores"/>
       </w:pPr>
       <w:r>
-        <w:t>Sistema de comentários</w:t>
+        <w:t xml:space="preserve">Sistema de </w:t>
       </w:r>
+      <w:proofErr w:type="spellStart"/>
+      <w:r>
+        <w:t>comentários</w:t>
+      </w:r>
+      <w:proofErr w:type="spellEnd"/>
+    </w:p>
+    <w:p>
+      <w:pPr>
+        <w:pStyle w:val="Commarcadores"/>
+      </w:pPr>
+      <w:r>
+        <w:t xml:space="preserve">Página </w:t>
+      </w:r>
+      <w:proofErr w:type="spellStart"/>
+      <w:r>
+        <w:t>detalhada</w:t>
+      </w:r>
+      <w:proofErr w:type="spellEnd"/>
+      <w:r>
+        <w:t xml:space="preserve"> para </w:t>
+      </w:r>
+      <w:proofErr w:type="spellStart"/>
+      <w:r>
+        <w:t>cada</w:t>
+      </w:r>
+      <w:proofErr w:type="spellEnd"/>
+      <w:r>
+        <w:t xml:space="preserve"> element da </w:t>
+      </w:r>
+      <w:proofErr w:type="spellStart"/>
+      <w:r>
+        <w:t>Biodiversidade</w:t>
+      </w:r>
+      <w:proofErr w:type="spellEnd"/>
     </w:p>
     <w:p>
       <w:pPr>

</xml_diff>

<commit_message>
arquivo de requisitos atualizado
</commit_message>
<xml_diff>
--- a/Requisitos_MVP_Circuito_Tere_Verde.docx
+++ b/Requisitos_MVP_Circuito_Tere_Verde.docx
@@ -662,7 +662,91 @@
           </w:tcPr>
           <w:p>
             <w:r>
-              <w:t>Armazenar dados em banco de dados.</w:t>
+              <w:t xml:space="preserve">Armazenar dados </w:t>
+            </w:r>
+            <w:proofErr w:type="spellStart"/>
+            <w:r>
+              <w:t>em</w:t>
+            </w:r>
+            <w:proofErr w:type="spellEnd"/>
+            <w:r>
+              <w:t xml:space="preserve"> banco de dados.</w:t>
+            </w:r>
+          </w:p>
+        </w:tc>
+      </w:tr>
+      <w:tr>
+        <w:trPr>
+          <w:trHeight w:val="774"/>
+        </w:trPr>
+        <w:tc>
+          <w:tcPr>
+            <w:tcW w:w="2880" w:type="dxa"/>
+          </w:tcPr>
+          <w:p>
+            <w:r>
+              <w:t>RNF</w:t>
+            </w:r>
+            <w:r>
+              <w:t>09</w:t>
+            </w:r>
+          </w:p>
+        </w:tc>
+        <w:tc>
+          <w:tcPr>
+            <w:tcW w:w="2880" w:type="dxa"/>
+          </w:tcPr>
+          <w:p>
+            <w:proofErr w:type="spellStart"/>
+            <w:r>
+              <w:t>Disponibilidade</w:t>
+            </w:r>
+            <w:proofErr w:type="spellEnd"/>
+          </w:p>
+        </w:tc>
+        <w:tc>
+          <w:tcPr>
+            <w:tcW w:w="2880" w:type="dxa"/>
+          </w:tcPr>
+          <w:p>
+            <w:pPr>
+              <w:rPr>
+                <w:lang w:val="pt-BR"/>
+              </w:rPr>
+            </w:pPr>
+            <w:r>
+              <w:rPr>
+                <w:lang w:val="pt-BR"/>
+              </w:rPr>
+              <w:t xml:space="preserve">A aplicação deve utilizar </w:t>
+            </w:r>
+            <w:proofErr w:type="spellStart"/>
+            <w:r>
+              <w:rPr>
+                <w:lang w:val="pt-BR"/>
+              </w:rPr>
+              <w:t>service</w:t>
+            </w:r>
+            <w:proofErr w:type="spellEnd"/>
+            <w:r>
+              <w:rPr>
+                <w:lang w:val="pt-BR"/>
+              </w:rPr>
+              <w:t xml:space="preserve"> </w:t>
+            </w:r>
+            <w:proofErr w:type="spellStart"/>
+            <w:r>
+              <w:rPr>
+                <w:lang w:val="pt-BR"/>
+              </w:rPr>
+              <w:t>worker</w:t>
+            </w:r>
+            <w:proofErr w:type="spellEnd"/>
+            <w:r>
+              <w:rPr>
+                <w:lang w:val="pt-BR"/>
+              </w:rPr>
+              <w:t xml:space="preserve"> e cache local para manter parte do conteúdo disponível offline.</w:t>
             </w:r>
           </w:p>
         </w:tc>
@@ -673,8 +757,13 @@
         <w:pStyle w:val="Ttulo2"/>
       </w:pPr>
       <w:r>
-        <w:t>Fora do Escopo</w:t>
+        <w:t xml:space="preserve">Fora do </w:t>
       </w:r>
+      <w:proofErr w:type="spellStart"/>
+      <w:r>
+        <w:t>Escopo</w:t>
+      </w:r>
+      <w:proofErr w:type="spellEnd"/>
     </w:p>
     <w:p>
       <w:pPr>
@@ -1582,7 +1671,6 @@
   <w:style w:type="character" w:default="1" w:styleId="Fontepargpadro">
     <w:name w:val="Default Paragraph Font"/>
     <w:uiPriority w:val="1"/>
-    <w:semiHidden/>
     <w:unhideWhenUsed/>
   </w:style>
   <w:style w:type="table" w:default="1" w:styleId="Tabelanormal">

</xml_diff>

<commit_message>
Atualizado lista de Requisitos
</commit_message>
<xml_diff>
--- a/Requisitos_MVP_Circuito_Tere_Verde.docx
+++ b/Requisitos_MVP_Circuito_Tere_Verde.docx
@@ -14,19 +14,9 @@
       <w:pPr>
         <w:pStyle w:val="Ttulo2"/>
       </w:pPr>
-      <w:proofErr w:type="spellStart"/>
       <w:r>
-        <w:t>Requisitos</w:t>
+        <w:t>Requisitos Funcionais</w:t>
       </w:r>
-      <w:proofErr w:type="spellEnd"/>
-      <w:r>
-        <w:t xml:space="preserve"> </w:t>
-      </w:r>
-      <w:proofErr w:type="spellStart"/>
-      <w:r>
-        <w:t>Funcionais</w:t>
-      </w:r>
-      <w:proofErr w:type="spellEnd"/>
     </w:p>
     <w:tbl>
       <w:tblPr>
@@ -662,15 +652,7 @@
           </w:tcPr>
           <w:p>
             <w:r>
-              <w:t xml:space="preserve">Armazenar dados </w:t>
-            </w:r>
-            <w:proofErr w:type="spellStart"/>
-            <w:r>
-              <w:t>em</w:t>
-            </w:r>
-            <w:proofErr w:type="spellEnd"/>
-            <w:r>
-              <w:t xml:space="preserve"> banco de dados.</w:t>
+              <w:t>Armazenar dados em banco de dados.</w:t>
             </w:r>
           </w:p>
         </w:tc>
@@ -697,11 +679,9 @@
             <w:tcW w:w="2880" w:type="dxa"/>
           </w:tcPr>
           <w:p>
-            <w:proofErr w:type="spellStart"/>
             <w:r>
               <w:t>Disponibilidade</w:t>
             </w:r>
-            <w:proofErr w:type="spellEnd"/>
           </w:p>
         </w:tc>
         <w:tc>
@@ -718,35 +698,7 @@
               <w:rPr>
                 <w:lang w:val="pt-BR"/>
               </w:rPr>
-              <w:t xml:space="preserve">A aplicação deve utilizar </w:t>
-            </w:r>
-            <w:proofErr w:type="spellStart"/>
-            <w:r>
-              <w:rPr>
-                <w:lang w:val="pt-BR"/>
-              </w:rPr>
-              <w:t>service</w:t>
-            </w:r>
-            <w:proofErr w:type="spellEnd"/>
-            <w:r>
-              <w:rPr>
-                <w:lang w:val="pt-BR"/>
-              </w:rPr>
-              <w:t xml:space="preserve"> </w:t>
-            </w:r>
-            <w:proofErr w:type="spellStart"/>
-            <w:r>
-              <w:rPr>
-                <w:lang w:val="pt-BR"/>
-              </w:rPr>
-              <w:t>worker</w:t>
-            </w:r>
-            <w:proofErr w:type="spellEnd"/>
-            <w:r>
-              <w:rPr>
-                <w:lang w:val="pt-BR"/>
-              </w:rPr>
-              <w:t xml:space="preserve"> e cache local para manter parte do conteúdo disponível offline.</w:t>
+              <w:t>A aplicação deve utilizar service worker e cache local para manter parte do conteúdo disponível offline.</w:t>
             </w:r>
           </w:p>
         </w:tc>
@@ -757,13 +709,8 @@
         <w:pStyle w:val="Ttulo2"/>
       </w:pPr>
       <w:r>
-        <w:t xml:space="preserve">Fora do </w:t>
+        <w:t>Fora do Escopo</w:t>
       </w:r>
-      <w:proofErr w:type="spellStart"/>
-      <w:r>
-        <w:t>Escopo</w:t>
-      </w:r>
-      <w:proofErr w:type="spellEnd"/>
     </w:p>
     <w:p>
       <w:pPr>
@@ -778,42 +725,22 @@
         <w:pStyle w:val="Commarcadores"/>
       </w:pPr>
       <w:r>
-        <w:t xml:space="preserve">Sistema de </w:t>
+        <w:t>Sistema de comentários</w:t>
       </w:r>
-      <w:proofErr w:type="spellStart"/>
-      <w:r>
-        <w:t>comentários</w:t>
-      </w:r>
-      <w:proofErr w:type="spellEnd"/>
     </w:p>
     <w:p>
       <w:pPr>
         <w:pStyle w:val="Commarcadores"/>
       </w:pPr>
       <w:r>
-        <w:t xml:space="preserve">Página </w:t>
+        <w:t>Página detalhada para cada element</w:t>
       </w:r>
-      <w:proofErr w:type="spellStart"/>
       <w:r>
-        <w:t>detalhada</w:t>
+        <w:t>o</w:t>
       </w:r>
-      <w:proofErr w:type="spellEnd"/>
       <w:r>
-        <w:t xml:space="preserve"> para </w:t>
+        <w:t xml:space="preserve"> da Biodiversidade</w:t>
       </w:r>
-      <w:proofErr w:type="spellStart"/>
-      <w:r>
-        <w:t>cada</w:t>
-      </w:r>
-      <w:proofErr w:type="spellEnd"/>
-      <w:r>
-        <w:t xml:space="preserve"> element da </w:t>
-      </w:r>
-      <w:proofErr w:type="spellStart"/>
-      <w:r>
-        <w:t>Biodiversidade</w:t>
-      </w:r>
-      <w:proofErr w:type="spellEnd"/>
     </w:p>
     <w:p>
       <w:pPr>
@@ -829,14 +756,6 @@
       </w:pPr>
       <w:r>
         <w:t>Avaliações de usuários</w:t>
-      </w:r>
-    </w:p>
-    <w:p>
-      <w:pPr>
-        <w:pStyle w:val="Commarcadores"/>
-      </w:pPr>
-      <w:r>
-        <w:t>Pagamento/Reserva</w:t>
       </w:r>
     </w:p>
     <w:p>
@@ -1671,6 +1590,7 @@
   <w:style w:type="character" w:default="1" w:styleId="Fontepargpadro">
     <w:name w:val="Default Paragraph Font"/>
     <w:uiPriority w:val="1"/>
+    <w:semiHidden/>
     <w:unhideWhenUsed/>
   </w:style>
   <w:style w:type="table" w:default="1" w:styleId="Tabelanormal">

</xml_diff>